<commit_message>
[FEATURE] Obs Design Pattern v0
</commit_message>
<xml_diff>
--- a/documents/Cuprins_SDV.docx
+++ b/documents/Cuprins_SDV.docx
@@ -1418,7 +1418,19 @@
           <w:rPr>
             <w:rStyle w:val="Hyperlink"/>
           </w:rPr>
-          <w:t>4.4.1. Epuizarea memoriei (heap slope → OOM)</w:t>
+          <w:t xml:space="preserve">4.4.1. Epuizarea memoriei (heap slope </w:t>
+        </w:r>
+        <w:r>
+          <w:rPr>
+            <w:rStyle w:val="Hyperlink"/>
+          </w:rPr>
+          <w:t>-</w:t>
+        </w:r>
+        <w:r>
+          <w:rPr>
+            <w:rStyle w:val="Hyperlink"/>
+          </w:rPr>
+          <w:t xml:space="preserve"> OOM)</w:t>
         </w:r>
         <w:r>
           <w:rPr>
@@ -3532,6 +3544,7 @@
   <w:style w:type="character" w:default="1" w:styleId="Fontdeparagrafimplicit">
     <w:name w:val="Default Paragraph Font"/>
     <w:uiPriority w:val="1"/>
+    <w:semiHidden/>
     <w:unhideWhenUsed/>
   </w:style>
   <w:style w:type="table" w:default="1" w:styleId="TabelNormal">

</xml_diff>